<commit_message>
CL3: Ledgerline Multi-AZ database limitation — scenario breadcrumb trail
A legacy-app constraint: Ledgerline is vendor-certified single-instance only, so the
database cannot be made Multi-AZ (the application tier can). Database reliability is
met by backup/restore + cross-Region DR, not automatic failover.

- new migration Technical Finding TF-03 (discovered-technical-limitation.md), CL3-scoped
- breadcrumbs into the current-state ICT records (application spec, infrastructure spec,
  operational costing): legacy-dating, the DB Multi-AZ constraint, and the
  replace-the-product-vs-accept cost note
- regenerated the approved improvement design (no DB Multi-AZ)

Co-Authored-By: Claude Opus 4.8 (1M context) <noreply@anthropic.com>
</commit_message>
<xml_diff>
--- a/public/documents/YAT-Accounting-Improved-Solution-Design.docx
+++ b/public/documents/YAT-Accounting-Improved-Solution-Design.docx
@@ -1053,7 +1053,7 @@
         <w:rPr>
           <w:sz w:val="21"/>
         </w:rPr>
-        <w:t>The database is single-AZ with no standby — an AZ or instance failure means an outage and a restore-from-backup, which a finance system the business depends on cannot absorb cleanly during business hours.</w:t>
+        <w:t>The database is a single instance with no standby. Ledgerline cannot run on a Multi-AZ (mirrored) database — it is vendor-certified single-instance only (see the Cloud Migration Technical Finding) — so automatic database failover is not available; an AZ or instance failure means an outage and a restore-from-backup. This residual single point of failure is mitigated, not eliminated, by the reliability improvements below.</w:t>
       </w:r>
     </w:p>
     <w:p>
@@ -1250,7 +1250,7 @@
               <w:rPr>
                 <w:sz w:val="18"/>
               </w:rPr>
-              <w:t>Single-AZ compute and database; 99.5% business-hours target</w:t>
+              <w:t>Single-AZ compute and single-instance database; 99.5% business-hours target</w:t>
             </w:r>
           </w:p>
         </w:tc>
@@ -1269,7 +1269,7 @@
               <w:rPr>
                 <w:sz w:val="18"/>
               </w:rPr>
-              <w:t>Remove the single-AZ SPOFs (Multi-AZ) so AZ/instance failure is survived automatically</w:t>
+              <w:t>Make the application tier Multi-AZ (survive AZ/instance failure automatically); the database cannot be Multi-AZ (Ledgerline constraint), so strengthen backup, point-in-time restore and cross-Region DR instead</w:t>
             </w:r>
           </w:p>
         </w:tc>
@@ -1639,7 +1639,7 @@
               <w:rPr>
                 <w:sz w:val="18"/>
               </w:rPr>
-              <w:t>Survive an AZ/instance failure automatically within business hours</w:t>
+              <w:t>App tier survives an AZ/instance failure automatically; database recovers within the business-day RTO from backup (Multi-AZ database not available — Ledgerline constraint)</w:t>
             </w:r>
           </w:p>
         </w:tc>
@@ -1658,7 +1658,7 @@
               <w:rPr>
                 <w:sz w:val="18"/>
               </w:rPr>
-              <w:t>RTO &lt; 15 min on AZ failure (auto-failover); 99.9% business-hours availability</w:t>
+              <w:t>App tier: auto-recovery &lt; 15 min on AZ/instance failure. Database: RPO &lt;= 1 hour (frequent log backups); RTO within the agreed business day via point-in-time restore / cross-Region copy</w:t>
             </w:r>
           </w:p>
         </w:tc>
@@ -1858,7 +1858,7 @@
         <w:rPr>
           <w:sz w:val="21"/>
         </w:rPr>
-        <w:t>Reviewed against IR-1 to IR-7, the improvement is: remove the single-AZ SPOFs (Multi-AZ across compute and database on a two-AZ network), harden security, realise the idle-profile and storage cost savings, confirm elastic headroom, and add the light India residency slice for regulatory logs and financial records. The application, its SQL Server stack and its data are preserved (IR-4); every change is proportionate and cost-justified (IR-2, IR-6).</w:t>
+        <w:t>Reviewed against IR-1 to IR-7, the improvement is: make the application tier Multi-AZ on a two-AZ network (the database stays single-instance — Ledgerline does not support Multi-AZ — with strengthened backup, point-in-time restore and cross-Region DR), harden security, realise the idle-profile and storage cost savings, confirm elastic headroom, and add the light India residency slice for regulatory logs and financial records. The application, its SQL Server stack and its data are preserved (IR-4); every change is proportionate and cost-justified (IR-2, IR-6).</w:t>
       </w:r>
     </w:p>
     <w:p>
@@ -2554,7 +2554,7 @@
               <w:rPr>
                 <w:sz w:val="18"/>
               </w:rPr>
-              <w:t>Multi-AZ deployment — synchronous standby in the second AZ with automatic failover; automated backups and point-in-time recovery</w:t>
+              <w:t>Single instance retained — Ledgerline does not support a Multi-AZ (mirrored) database (see the Cloud Migration Technical Finding), so automatic failover is not an option. Reliability is delivered instead by automated backups with point-in-time recovery, frequent transaction-log backups (RPO &lt;= 1 hour), an automated cross-Region backup copy to a second Australian Region (Melbourne, ap-southeast-4) for disaster recovery — keeping financial data in Australia — and a tested restore runbook that recovers within the business-day RTO</w:t>
             </w:r>
           </w:p>
         </w:tc>
@@ -2643,6 +2643,14 @@
       </w:tr>
     </w:tbl>
     <w:p/>
+    <w:p>
+      <w:r>
+        <w:rPr>
+          <w:sz w:val="21"/>
+        </w:rPr>
+        <w:t>Reliability decision — cost versus benefit (IR-2, IR-6). The only way to give the database automatic high availability would be to replace Ledgerline with an accounting product that supports a Multi-AZ database — a new software licence, a full data-migration project, staff retraining and change management, and the associated delivery and business risk. Weighed against the actual need — an internal, business-hours finance system with outsourced payroll, an estimated $400/hour business-hours cost of downtime, and an accepted business-day RTO — that programme is disproportionate and is not recommended. The proportionate choice is to keep Ledgerline on a single-instance database and meet reliability through robust automated backups, point-in-time restore and cross-Region DR, accepting a short, bounded restore-time gap on the rare AZ/instance failure. The application tier is made Multi-AZ regardless, because that is low-cost and fully supported.</w:t>
+      </w:r>
+    </w:p>
     <w:p>
       <w:pPr>
         <w:pStyle w:val="Heading3"/>
@@ -2894,7 +2902,7 @@
         <w:rPr>
           <w:sz w:val="21"/>
         </w:rPr>
-        <w:t>CloudWatch metrics, dashboards and alarms per component provide the measures the goals (§3.3) are tested against and keep the environment operable by YAT in-house ICT (IR-5); CloudTrail records the audit trail (also feeding the India log slice). Alerting covers AZ-failover, scaling events, and backup/lifecycle health.</w:t>
+        <w:t>CloudWatch metrics, dashboards and alarms per component provide the measures the goals (§3.3) are tested against and keep the environment operable by YAT in-house ICT (IR-5); CloudTrail records the audit trail (also feeding the India log slice). Alerting covers application-tier AZ failover, scaling events, and database backup / restore and lifecycle health.</w:t>
       </w:r>
     </w:p>
     <w:p>
@@ -2926,7 +2934,7 @@
         <w:rPr>
           <w:sz w:val="21"/>
         </w:rPr>
-        <w:t>Each goal in §3.3 is met by the design above: reliability by Multi-AZ across compute and database on a two-AZ network (auto-failover); scalability by the retained ASG target-tracking plus elastic storage and endpoint headroom (demonstrable on demand, not over-provisioned); cost by the business-hours schedule, storage tiering, right-sizing and the licensing review; security by the hardening, encryption and least-privilege posture; compliance by the India residency slice.</w:t>
+        <w:t>Each goal in §3.3 is met by the design above: reliability by a Multi-AZ application tier on a two-AZ network (auto-failover) plus strengthened database backup, point-in-time restore and cross-Region DR (the database cannot be Multi-AZ — Ledgerline constraint); scalability by the retained ASG target-tracking plus elastic storage and endpoint headroom (demonstrable on demand, not over-provisioned); cost by the business-hours schedule, storage tiering, right-sizing and the licensing review; security by the hardening, encryption and least-privilege posture; compliance by the India residency slice.</w:t>
       </w:r>
     </w:p>
     <w:p>
@@ -2942,7 +2950,7 @@
         <w:rPr>
           <w:sz w:val="21"/>
         </w:rPr>
-        <w:t>The single-AZ compute and single-AZ database SPOFs (§3.1) are removed: the application tier runs across two AZs behind the internal ALB, and the database runs Multi-AZ with automatic failover, on a network that now spans both AZs.</w:t>
+        <w:t>The single-AZ compute SPOF (§3.1) is removed: the application tier runs across two AZs behind the internal ALB on a network that now spans both AZs. The database remains a single instance — Ledgerline does not support Multi-AZ — so its outage risk is not eliminated but is mitigated to a short, bounded restore-time gap by automated backups, point-in-time restore and a cross-Region DR copy; accepting that residual risk is the proportionate, cost-justified decision (§4.6).</w:t>
       </w:r>
     </w:p>
     <w:p>
@@ -3196,7 +3204,7 @@
               <w:rPr>
                 <w:sz w:val="18"/>
               </w:rPr>
-              <w:t>Database stack — convert RDS to Multi-AZ; encryption; secrets</w:t>
+              <w:t>Database stack — strengthen backups (frequent log backups, cross-Region copy to Melbourne), DR runbook; encryption in transit; secrets</w:t>
             </w:r>
           </w:p>
         </w:tc>
@@ -3215,7 +3223,7 @@
               <w:rPr>
                 <w:sz w:val="18"/>
               </w:rPr>
-              <w:t>Brief failover blip; scheduled in a maintenance window</w:t>
+              <w:t>None — additive; no failover reconfiguration (single instance retained)</w:t>
             </w:r>
           </w:p>
         </w:tc>
@@ -3306,7 +3314,7 @@
         <w:rPr>
           <w:sz w:val="21"/>
         </w:rPr>
-        <w:t>Reliability — force an AZ/instance failure (reboot-with-failover on RDS; terminate an app instance) and confirm automatic recovery within the RTO, with no data loss.</w:t>
+        <w:t>Reliability — terminate an app instance and confirm the ASG replaces it across AZs with no outage (application-tier auto-recovery); for the database, perform a point-in-time restore and a cross-Region (Melbourne) DR restore and confirm recovery within the business-day RTO with RPO &lt;= 1 hour and no data loss. The database is single-instance — no Multi-AZ failover to test — per the Ledgerline constraint.</w:t>
       </w:r>
     </w:p>
     <w:p>

</xml_diff>